<commit_message>
Remove fabricated train CRC statistic and purge unverified DOIs from references
</commit_message>
<xml_diff>
--- a/DeepSense6G_Final_Report.docx
+++ b/DeepSense6G_Final_Report.docx
@@ -1282,607 +1282,9 @@
           <w:color w:val="212529"/>
           <w:sz w:val="20"/>
         </w:rPr>
-        <w:t>Random row-level splitting of overlapping sliding windows severely leaks temporal information, because sample t and sample t+1 share 29 of their 30 observation frames. We enforce an authenticated zero-leakage protocol by partitioning all 124 continuous driving trajectories into mutually disjoint sets, detailed in Table II.</w:t>
+        <w:t>Random row-level splitting of overlapping sliding windows severely leaks temporal information, because sample t and sample t+1 share 29 of their 30 observation frames. We enforce an authenticated zero-leakage protocol by partitioning all 124 continuous driving trajectories into mutually disjoint sets: Train (68 drives, 13,260 sequences, 54.8%), Validation (19 drives, 3,705 sequences, 15.3%), Calibration (19 drives, 3,705 sequences, 15.3%), and Test (18 drives, 3,509 sequences, 14.5%).</w:t>
       </w:r>
     </w:p>
-    <w:p>
-      <w:pPr>
-        <w:spacing w:before="160"/>
-        <w:jc w:val="center"/>
-      </w:pPr>
-      <w:r>
-        <w:rPr>
-          <w:rFonts w:ascii="Times New Roman" w:hAnsi="Times New Roman"/>
-          <w:b/>
-          <w:sz w:val="17"/>
-        </w:rPr>
-        <w:t>TABLE II: ZERO-LEAKAGE TRAJECTORY SPLIT SIZES &amp; EMPIRICAL CRC COVERAGE</w:t>
-      </w:r>
-    </w:p>
-    <w:tbl>
-      <w:tblPr>
-        <w:tblW w:type="auto" w:w="0"/>
-        <w:jc w:val="center"/>
-        <w:tblLook w:firstColumn="1" w:firstRow="1" w:lastColumn="0" w:lastRow="0" w:noHBand="0" w:noVBand="1" w:val="04A0"/>
-      </w:tblPr>
-      <w:tblGrid>
-        <w:gridCol w:w="2016"/>
-        <w:gridCol w:w="2016"/>
-        <w:gridCol w:w="2016"/>
-        <w:gridCol w:w="2016"/>
-        <w:gridCol w:w="2016"/>
-      </w:tblGrid>
-      <w:tr>
-        <w:tc>
-          <w:tcPr>
-            <w:tcW w:type="dxa" w:w="2016"/>
-            <w:shd w:fill="0F2240"/>
-            <w:tcMar>
-              <w:top w:w="70" w:type="dxa"/>
-              <w:bottom w:w="70" w:type="dxa"/>
-              <w:left w:w="80" w:type="dxa"/>
-              <w:right w:w="80" w:type="dxa"/>
-            </w:tcMar>
-          </w:tcPr>
-          <w:p>
-            <w:r>
-              <w:rPr>
-                <w:rFonts w:ascii="Times New Roman" w:hAnsi="Times New Roman"/>
-                <w:b/>
-                <w:color w:val="FFFFFF"/>
-                <w:sz w:val="16"/>
-              </w:rPr>
-              <w:t>Split Name</w:t>
-            </w:r>
-          </w:p>
-        </w:tc>
-        <w:tc>
-          <w:tcPr>
-            <w:tcW w:type="dxa" w:w="2016"/>
-            <w:shd w:fill="0F2240"/>
-            <w:tcMar>
-              <w:top w:w="70" w:type="dxa"/>
-              <w:bottom w:w="70" w:type="dxa"/>
-              <w:left w:w="80" w:type="dxa"/>
-              <w:right w:w="80" w:type="dxa"/>
-            </w:tcMar>
-          </w:tcPr>
-          <w:p>
-            <w:r>
-              <w:rPr>
-                <w:rFonts w:ascii="Times New Roman" w:hAnsi="Times New Roman"/>
-                <w:b/>
-                <w:color w:val="FFFFFF"/>
-                <w:sz w:val="16"/>
-              </w:rPr>
-              <w:t>Drives</w:t>
-            </w:r>
-          </w:p>
-        </w:tc>
-        <w:tc>
-          <w:tcPr>
-            <w:tcW w:type="dxa" w:w="2016"/>
-            <w:shd w:fill="0F2240"/>
-            <w:tcMar>
-              <w:top w:w="70" w:type="dxa"/>
-              <w:bottom w:w="70" w:type="dxa"/>
-              <w:left w:w="80" w:type="dxa"/>
-              <w:right w:w="80" w:type="dxa"/>
-            </w:tcMar>
-          </w:tcPr>
-          <w:p>
-            <w:r>
-              <w:rPr>
-                <w:rFonts w:ascii="Times New Roman" w:hAnsi="Times New Roman"/>
-                <w:b/>
-                <w:color w:val="FFFFFF"/>
-                <w:sz w:val="16"/>
-              </w:rPr>
-              <w:t>Sequences</w:t>
-            </w:r>
-          </w:p>
-        </w:tc>
-        <w:tc>
-          <w:tcPr>
-            <w:tcW w:type="dxa" w:w="2016"/>
-            <w:shd w:fill="0F2240"/>
-            <w:tcMar>
-              <w:top w:w="70" w:type="dxa"/>
-              <w:bottom w:w="70" w:type="dxa"/>
-              <w:left w:w="80" w:type="dxa"/>
-              <w:right w:w="80" w:type="dxa"/>
-            </w:tcMar>
-          </w:tcPr>
-          <w:p>
-            <w:r>
-              <w:rPr>
-                <w:rFonts w:ascii="Times New Roman" w:hAnsi="Times New Roman"/>
-                <w:b/>
-                <w:color w:val="FFFFFF"/>
-                <w:sz w:val="16"/>
-              </w:rPr>
-              <w:t>Mean CRC Set Size</w:t>
-            </w:r>
-          </w:p>
-        </w:tc>
-        <w:tc>
-          <w:tcPr>
-            <w:tcW w:type="dxa" w:w="2016"/>
-            <w:shd w:fill="0F2240"/>
-            <w:tcMar>
-              <w:top w:w="70" w:type="dxa"/>
-              <w:bottom w:w="70" w:type="dxa"/>
-              <w:left w:w="80" w:type="dxa"/>
-              <w:right w:w="80" w:type="dxa"/>
-            </w:tcMar>
-          </w:tcPr>
-          <w:p>
-            <w:r>
-              <w:rPr>
-                <w:rFonts w:ascii="Times New Roman" w:hAnsi="Times New Roman"/>
-                <w:b/>
-                <w:color w:val="FFFFFF"/>
-                <w:sz w:val="16"/>
-              </w:rPr>
-              <w:t>Empirical Coverage (Target ≥ 90%)</w:t>
-            </w:r>
-          </w:p>
-        </w:tc>
-      </w:tr>
-      <w:tr>
-        <w:tc>
-          <w:tcPr>
-            <w:tcW w:type="dxa" w:w="2016"/>
-            <w:shd w:fill="F8F9FA"/>
-            <w:tcMar>
-              <w:top w:w="50" w:type="dxa"/>
-              <w:bottom w:w="50" w:type="dxa"/>
-              <w:left w:w="70" w:type="dxa"/>
-              <w:right w:w="70" w:type="dxa"/>
-            </w:tcMar>
-          </w:tcPr>
-          <w:p>
-            <w:r>
-              <w:rPr>
-                <w:rFonts w:ascii="Times New Roman" w:hAnsi="Times New Roman"/>
-                <w:b/>
-                <w:color w:val="212529"/>
-                <w:sz w:val="16"/>
-              </w:rPr>
-              <w:t>Train Set</w:t>
-            </w:r>
-          </w:p>
-        </w:tc>
-        <w:tc>
-          <w:tcPr>
-            <w:tcW w:type="dxa" w:w="2016"/>
-            <w:shd w:fill="F8F9FA"/>
-            <w:tcMar>
-              <w:top w:w="50" w:type="dxa"/>
-              <w:bottom w:w="50" w:type="dxa"/>
-              <w:left w:w="70" w:type="dxa"/>
-              <w:right w:w="70" w:type="dxa"/>
-            </w:tcMar>
-          </w:tcPr>
-          <w:p>
-            <w:r>
-              <w:rPr>
-                <w:rFonts w:ascii="Times New Roman" w:hAnsi="Times New Roman"/>
-                <w:color w:val="212529"/>
-                <w:sz w:val="16"/>
-              </w:rPr>
-              <w:t>68 drives</w:t>
-            </w:r>
-          </w:p>
-        </w:tc>
-        <w:tc>
-          <w:tcPr>
-            <w:tcW w:type="dxa" w:w="2016"/>
-            <w:shd w:fill="F8F9FA"/>
-            <w:tcMar>
-              <w:top w:w="50" w:type="dxa"/>
-              <w:bottom w:w="50" w:type="dxa"/>
-              <w:left w:w="70" w:type="dxa"/>
-              <w:right w:w="70" w:type="dxa"/>
-            </w:tcMar>
-          </w:tcPr>
-          <w:p>
-            <w:r>
-              <w:rPr>
-                <w:rFonts w:ascii="Times New Roman" w:hAnsi="Times New Roman"/>
-                <w:color w:val="212529"/>
-                <w:sz w:val="16"/>
-              </w:rPr>
-              <w:t>13,260 (54.8%)</w:t>
-            </w:r>
-          </w:p>
-        </w:tc>
-        <w:tc>
-          <w:tcPr>
-            <w:tcW w:type="dxa" w:w="2016"/>
-            <w:shd w:fill="F8F9FA"/>
-            <w:tcMar>
-              <w:top w:w="50" w:type="dxa"/>
-              <w:bottom w:w="50" w:type="dxa"/>
-              <w:left w:w="70" w:type="dxa"/>
-              <w:right w:w="70" w:type="dxa"/>
-            </w:tcMar>
-          </w:tcPr>
-          <w:p>
-            <w:r>
-              <w:rPr>
-                <w:rFonts w:ascii="Times New Roman" w:hAnsi="Times New Roman"/>
-                <w:color w:val="212529"/>
-                <w:sz w:val="16"/>
-              </w:rPr>
-              <w:t>3.2 / 256 beams</w:t>
-            </w:r>
-          </w:p>
-        </w:tc>
-        <w:tc>
-          <w:tcPr>
-            <w:tcW w:type="dxa" w:w="2016"/>
-            <w:shd w:fill="F8F9FA"/>
-            <w:tcMar>
-              <w:top w:w="50" w:type="dxa"/>
-              <w:bottom w:w="50" w:type="dxa"/>
-              <w:left w:w="70" w:type="dxa"/>
-              <w:right w:w="70" w:type="dxa"/>
-            </w:tcMar>
-          </w:tcPr>
-          <w:p>
-            <w:r>
-              <w:rPr>
-                <w:rFonts w:ascii="Times New Roman" w:hAnsi="Times New Roman"/>
-                <w:color w:val="212529"/>
-                <w:sz w:val="16"/>
-              </w:rPr>
-              <w:t>98.4% (In-sample training fit)</w:t>
-            </w:r>
-          </w:p>
-        </w:tc>
-      </w:tr>
-      <w:tr>
-        <w:tc>
-          <w:tcPr>
-            <w:tcW w:type="dxa" w:w="2016"/>
-            <w:shd w:fill="FFFFFF"/>
-            <w:tcMar>
-              <w:top w:w="50" w:type="dxa"/>
-              <w:bottom w:w="50" w:type="dxa"/>
-              <w:left w:w="70" w:type="dxa"/>
-              <w:right w:w="70" w:type="dxa"/>
-            </w:tcMar>
-          </w:tcPr>
-          <w:p>
-            <w:r>
-              <w:rPr>
-                <w:rFonts w:ascii="Times New Roman" w:hAnsi="Times New Roman"/>
-                <w:b/>
-                <w:color w:val="212529"/>
-                <w:sz w:val="16"/>
-              </w:rPr>
-              <w:t>Validation Set</w:t>
-            </w:r>
-          </w:p>
-        </w:tc>
-        <w:tc>
-          <w:tcPr>
-            <w:tcW w:type="dxa" w:w="2016"/>
-            <w:shd w:fill="FFFFFF"/>
-            <w:tcMar>
-              <w:top w:w="50" w:type="dxa"/>
-              <w:bottom w:w="50" w:type="dxa"/>
-              <w:left w:w="70" w:type="dxa"/>
-              <w:right w:w="70" w:type="dxa"/>
-            </w:tcMar>
-          </w:tcPr>
-          <w:p>
-            <w:r>
-              <w:rPr>
-                <w:rFonts w:ascii="Times New Roman" w:hAnsi="Times New Roman"/>
-                <w:color w:val="212529"/>
-                <w:sz w:val="16"/>
-              </w:rPr>
-              <w:t>19 drives</w:t>
-            </w:r>
-          </w:p>
-        </w:tc>
-        <w:tc>
-          <w:tcPr>
-            <w:tcW w:type="dxa" w:w="2016"/>
-            <w:shd w:fill="FFFFFF"/>
-            <w:tcMar>
-              <w:top w:w="50" w:type="dxa"/>
-              <w:bottom w:w="50" w:type="dxa"/>
-              <w:left w:w="70" w:type="dxa"/>
-              <w:right w:w="70" w:type="dxa"/>
-            </w:tcMar>
-          </w:tcPr>
-          <w:p>
-            <w:r>
-              <w:rPr>
-                <w:rFonts w:ascii="Times New Roman" w:hAnsi="Times New Roman"/>
-                <w:color w:val="212529"/>
-                <w:sz w:val="16"/>
-              </w:rPr>
-              <w:t>3,705 (15.3%)</w:t>
-            </w:r>
-          </w:p>
-        </w:tc>
-        <w:tc>
-          <w:tcPr>
-            <w:tcW w:type="dxa" w:w="2016"/>
-            <w:shd w:fill="FFFFFF"/>
-            <w:tcMar>
-              <w:top w:w="50" w:type="dxa"/>
-              <w:bottom w:w="50" w:type="dxa"/>
-              <w:left w:w="70" w:type="dxa"/>
-              <w:right w:w="70" w:type="dxa"/>
-            </w:tcMar>
-          </w:tcPr>
-          <w:p>
-            <w:r>
-              <w:rPr>
-                <w:rFonts w:ascii="Times New Roman" w:hAnsi="Times New Roman"/>
-                <w:color w:val="212529"/>
-                <w:sz w:val="16"/>
-              </w:rPr>
-              <w:t>11.8 / 256 beams</w:t>
-            </w:r>
-          </w:p>
-        </w:tc>
-        <w:tc>
-          <w:tcPr>
-            <w:tcW w:type="dxa" w:w="2016"/>
-            <w:shd w:fill="FFFFFF"/>
-            <w:tcMar>
-              <w:top w:w="50" w:type="dxa"/>
-              <w:bottom w:w="50" w:type="dxa"/>
-              <w:left w:w="70" w:type="dxa"/>
-              <w:right w:w="70" w:type="dxa"/>
-            </w:tcMar>
-          </w:tcPr>
-          <w:p>
-            <w:r>
-              <w:rPr>
-                <w:rFonts w:ascii="Times New Roman" w:hAnsi="Times New Roman"/>
-                <w:color w:val="212529"/>
-                <w:sz w:val="16"/>
-              </w:rPr>
-              <w:t>68.7% (Degraded under shift)</w:t>
-            </w:r>
-          </w:p>
-        </w:tc>
-      </w:tr>
-      <w:tr>
-        <w:tc>
-          <w:tcPr>
-            <w:tcW w:type="dxa" w:w="2016"/>
-            <w:shd w:fill="F8F9FA"/>
-            <w:tcMar>
-              <w:top w:w="50" w:type="dxa"/>
-              <w:bottom w:w="50" w:type="dxa"/>
-              <w:left w:w="70" w:type="dxa"/>
-              <w:right w:w="70" w:type="dxa"/>
-            </w:tcMar>
-          </w:tcPr>
-          <w:p>
-            <w:r>
-              <w:rPr>
-                <w:rFonts w:ascii="Times New Roman" w:hAnsi="Times New Roman"/>
-                <w:b/>
-                <w:color w:val="212529"/>
-                <w:sz w:val="16"/>
-              </w:rPr>
-              <w:t>Calibration Set</w:t>
-            </w:r>
-          </w:p>
-        </w:tc>
-        <w:tc>
-          <w:tcPr>
-            <w:tcW w:type="dxa" w:w="2016"/>
-            <w:shd w:fill="F8F9FA"/>
-            <w:tcMar>
-              <w:top w:w="50" w:type="dxa"/>
-              <w:bottom w:w="50" w:type="dxa"/>
-              <w:left w:w="70" w:type="dxa"/>
-              <w:right w:w="70" w:type="dxa"/>
-            </w:tcMar>
-          </w:tcPr>
-          <w:p>
-            <w:r>
-              <w:rPr>
-                <w:rFonts w:ascii="Times New Roman" w:hAnsi="Times New Roman"/>
-                <w:color w:val="212529"/>
-                <w:sz w:val="16"/>
-              </w:rPr>
-              <w:t>19 drives</w:t>
-            </w:r>
-          </w:p>
-        </w:tc>
-        <w:tc>
-          <w:tcPr>
-            <w:tcW w:type="dxa" w:w="2016"/>
-            <w:shd w:fill="F8F9FA"/>
-            <w:tcMar>
-              <w:top w:w="50" w:type="dxa"/>
-              <w:bottom w:w="50" w:type="dxa"/>
-              <w:left w:w="70" w:type="dxa"/>
-              <w:right w:w="70" w:type="dxa"/>
-            </w:tcMar>
-          </w:tcPr>
-          <w:p>
-            <w:r>
-              <w:rPr>
-                <w:rFonts w:ascii="Times New Roman" w:hAnsi="Times New Roman"/>
-                <w:color w:val="212529"/>
-                <w:sz w:val="16"/>
-              </w:rPr>
-              <w:t>3,705 (15.3%)</w:t>
-            </w:r>
-          </w:p>
-        </w:tc>
-        <w:tc>
-          <w:tcPr>
-            <w:tcW w:type="dxa" w:w="2016"/>
-            <w:shd w:fill="F8F9FA"/>
-            <w:tcMar>
-              <w:top w:w="50" w:type="dxa"/>
-              <w:bottom w:w="50" w:type="dxa"/>
-              <w:left w:w="70" w:type="dxa"/>
-              <w:right w:w="70" w:type="dxa"/>
-            </w:tcMar>
-          </w:tcPr>
-          <w:p>
-            <w:r>
-              <w:rPr>
-                <w:rFonts w:ascii="Times New Roman" w:hAnsi="Times New Roman"/>
-                <w:color w:val="212529"/>
-                <w:sz w:val="16"/>
-              </w:rPr>
-              <w:t>12.1 / 256 beams</w:t>
-            </w:r>
-          </w:p>
-        </w:tc>
-        <w:tc>
-          <w:tcPr>
-            <w:tcW w:type="dxa" w:w="2016"/>
-            <w:shd w:fill="F8F9FA"/>
-            <w:tcMar>
-              <w:top w:w="50" w:type="dxa"/>
-              <w:bottom w:w="50" w:type="dxa"/>
-              <w:left w:w="70" w:type="dxa"/>
-              <w:right w:w="70" w:type="dxa"/>
-            </w:tcMar>
-          </w:tcPr>
-          <w:p>
-            <w:r>
-              <w:rPr>
-                <w:rFonts w:ascii="Times New Roman" w:hAnsi="Times New Roman"/>
-                <w:color w:val="212529"/>
-                <w:sz w:val="16"/>
-              </w:rPr>
-              <w:t>90.2% (Satisfied by construction)</w:t>
-            </w:r>
-          </w:p>
-        </w:tc>
-      </w:tr>
-      <w:tr>
-        <w:tc>
-          <w:tcPr>
-            <w:tcW w:type="dxa" w:w="2016"/>
-            <w:shd w:fill="FFFFFF"/>
-            <w:tcMar>
-              <w:top w:w="50" w:type="dxa"/>
-              <w:bottom w:w="50" w:type="dxa"/>
-              <w:left w:w="70" w:type="dxa"/>
-              <w:right w:w="70" w:type="dxa"/>
-            </w:tcMar>
-          </w:tcPr>
-          <w:p>
-            <w:r>
-              <w:rPr>
-                <w:rFonts w:ascii="Times New Roman" w:hAnsi="Times New Roman"/>
-                <w:b/>
-                <w:color w:val="212529"/>
-                <w:sz w:val="16"/>
-              </w:rPr>
-              <w:t>Test Set (Unseen)</w:t>
-            </w:r>
-          </w:p>
-        </w:tc>
-        <w:tc>
-          <w:tcPr>
-            <w:tcW w:type="dxa" w:w="2016"/>
-            <w:shd w:fill="FFFFFF"/>
-            <w:tcMar>
-              <w:top w:w="50" w:type="dxa"/>
-              <w:bottom w:w="50" w:type="dxa"/>
-              <w:left w:w="70" w:type="dxa"/>
-              <w:right w:w="70" w:type="dxa"/>
-            </w:tcMar>
-          </w:tcPr>
-          <w:p>
-            <w:r>
-              <w:rPr>
-                <w:rFonts w:ascii="Times New Roman" w:hAnsi="Times New Roman"/>
-                <w:color w:val="212529"/>
-                <w:sz w:val="16"/>
-              </w:rPr>
-              <w:t>18 drives</w:t>
-            </w:r>
-          </w:p>
-        </w:tc>
-        <w:tc>
-          <w:tcPr>
-            <w:tcW w:type="dxa" w:w="2016"/>
-            <w:shd w:fill="FFFFFF"/>
-            <w:tcMar>
-              <w:top w:w="50" w:type="dxa"/>
-              <w:bottom w:w="50" w:type="dxa"/>
-              <w:left w:w="70" w:type="dxa"/>
-              <w:right w:w="70" w:type="dxa"/>
-            </w:tcMar>
-          </w:tcPr>
-          <w:p>
-            <w:r>
-              <w:rPr>
-                <w:rFonts w:ascii="Times New Roman" w:hAnsi="Times New Roman"/>
-                <w:color w:val="212529"/>
-                <w:sz w:val="16"/>
-              </w:rPr>
-              <w:t>3,509 (14.5%)</w:t>
-            </w:r>
-          </w:p>
-        </w:tc>
-        <w:tc>
-          <w:tcPr>
-            <w:tcW w:type="dxa" w:w="2016"/>
-            <w:shd w:fill="FFFFFF"/>
-            <w:tcMar>
-              <w:top w:w="50" w:type="dxa"/>
-              <w:bottom w:w="50" w:type="dxa"/>
-              <w:left w:w="70" w:type="dxa"/>
-              <w:right w:w="70" w:type="dxa"/>
-            </w:tcMar>
-          </w:tcPr>
-          <w:p>
-            <w:r>
-              <w:rPr>
-                <w:rFonts w:ascii="Times New Roman" w:hAnsi="Times New Roman"/>
-                <w:color w:val="212529"/>
-                <w:sz w:val="16"/>
-              </w:rPr>
-              <w:t>13.9 / 256 beams</w:t>
-            </w:r>
-          </w:p>
-        </w:tc>
-        <w:tc>
-          <w:tcPr>
-            <w:tcW w:type="dxa" w:w="2016"/>
-            <w:shd w:fill="FFFFFF"/>
-            <w:tcMar>
-              <w:top w:w="50" w:type="dxa"/>
-              <w:bottom w:w="50" w:type="dxa"/>
-              <w:left w:w="70" w:type="dxa"/>
-              <w:right w:w="70" w:type="dxa"/>
-            </w:tcMar>
-          </w:tcPr>
-          <w:p>
-            <w:r>
-              <w:rPr>
-                <w:rFonts w:ascii="Times New Roman" w:hAnsi="Times New Roman"/>
-                <w:b/>
-                <w:color w:val="B91C1C"/>
-                <w:sz w:val="16"/>
-              </w:rPr>
-              <w:t>33.4% (Severe coverage collapse)</w:t>
-            </w:r>
-          </w:p>
-        </w:tc>
-      </w:tr>
-    </w:tbl>
     <w:p>
       <w:pPr>
         <w:keepNext/>
@@ -2157,7 +1559,505 @@
           <w:color w:val="212529"/>
           <w:sz w:val="20"/>
         </w:rPr>
-        <w:t>The theoretical guarantee of static CRC relies entirely on sample exchangeability. As shown in Table II, while empirical coverage on the calibration split meets the 90% target exactly (90.2%), coverage degrades to 68.7% on validation drives and collapses to 33.4% on test drives. This 2.7× shortfall is a primary empirical contribution of this paper: it demonstrates that vehicular trajectory shifts (road curvature, lighting changes, variable traffic occlusion) systematically violate exchangeability, proving that one-shot offline calibration is unsafe for physical autonomous vehicles.</w:t>
+        <w:t>The theoretical guarantee of static CRC relies entirely on sample exchangeability. Importantly, because Conformal Risk Control is calibrated on a dedicated held-out calibration split (n = 3,705) disjoint from model parameter fitting, CRC coverage is evaluated strictly out-of-sample on validation and test trajectories; train coverage is not evaluated by design. Table II reports the empirical coverage of C(S) across the evaluated splits under the miss criterion Loss(C) &gt; Δ_dB = 3.0 dB.</w:t>
+      </w:r>
+    </w:p>
+    <w:p>
+      <w:pPr>
+        <w:spacing w:before="160"/>
+        <w:jc w:val="center"/>
+      </w:pPr>
+      <w:r>
+        <w:rPr>
+          <w:rFonts w:ascii="Times New Roman" w:hAnsi="Times New Roman"/>
+          <w:b/>
+          <w:sz w:val="17"/>
+        </w:rPr>
+        <w:t>TABLE II: EMPIRICAL CONFORMAL RISK CONTROL (CRC) COVERAGE UNDER DISTRIBUTION SHIFT</w:t>
+      </w:r>
+    </w:p>
+    <w:tbl>
+      <w:tblPr>
+        <w:tblW w:type="auto" w:w="0"/>
+        <w:jc w:val="center"/>
+        <w:tblLook w:firstColumn="1" w:firstRow="1" w:lastColumn="0" w:lastRow="0" w:noHBand="0" w:noVBand="1" w:val="04A0"/>
+      </w:tblPr>
+      <w:tblGrid>
+        <w:gridCol w:w="2016"/>
+        <w:gridCol w:w="2016"/>
+        <w:gridCol w:w="2016"/>
+        <w:gridCol w:w="2016"/>
+        <w:gridCol w:w="2016"/>
+      </w:tblGrid>
+      <w:tr>
+        <w:tc>
+          <w:tcPr>
+            <w:tcW w:type="dxa" w:w="2016"/>
+            <w:shd w:fill="0F2240"/>
+            <w:tcMar>
+              <w:top w:w="70" w:type="dxa"/>
+              <w:bottom w:w="70" w:type="dxa"/>
+              <w:left w:w="80" w:type="dxa"/>
+              <w:right w:w="80" w:type="dxa"/>
+            </w:tcMar>
+          </w:tcPr>
+          <w:p>
+            <w:r>
+              <w:rPr>
+                <w:rFonts w:ascii="Times New Roman" w:hAnsi="Times New Roman"/>
+                <w:b/>
+                <w:color w:val="FFFFFF"/>
+                <w:sz w:val="16"/>
+              </w:rPr>
+              <w:t>Evaluated Partition</w:t>
+            </w:r>
+          </w:p>
+        </w:tc>
+        <w:tc>
+          <w:tcPr>
+            <w:tcW w:type="dxa" w:w="2016"/>
+            <w:shd w:fill="0F2240"/>
+            <w:tcMar>
+              <w:top w:w="70" w:type="dxa"/>
+              <w:bottom w:w="70" w:type="dxa"/>
+              <w:left w:w="80" w:type="dxa"/>
+              <w:right w:w="80" w:type="dxa"/>
+            </w:tcMar>
+          </w:tcPr>
+          <w:p>
+            <w:r>
+              <w:rPr>
+                <w:rFonts w:ascii="Times New Roman" w:hAnsi="Times New Roman"/>
+                <w:b/>
+                <w:color w:val="FFFFFF"/>
+                <w:sz w:val="16"/>
+              </w:rPr>
+              <w:t>Drives</w:t>
+            </w:r>
+          </w:p>
+        </w:tc>
+        <w:tc>
+          <w:tcPr>
+            <w:tcW w:type="dxa" w:w="2016"/>
+            <w:shd w:fill="0F2240"/>
+            <w:tcMar>
+              <w:top w:w="70" w:type="dxa"/>
+              <w:bottom w:w="70" w:type="dxa"/>
+              <w:left w:w="80" w:type="dxa"/>
+              <w:right w:w="80" w:type="dxa"/>
+            </w:tcMar>
+          </w:tcPr>
+          <w:p>
+            <w:r>
+              <w:rPr>
+                <w:rFonts w:ascii="Times New Roman" w:hAnsi="Times New Roman"/>
+                <w:b/>
+                <w:color w:val="FFFFFF"/>
+                <w:sz w:val="16"/>
+              </w:rPr>
+              <w:t>Sequences</w:t>
+            </w:r>
+          </w:p>
+        </w:tc>
+        <w:tc>
+          <w:tcPr>
+            <w:tcW w:type="dxa" w:w="2016"/>
+            <w:shd w:fill="0F2240"/>
+            <w:tcMar>
+              <w:top w:w="70" w:type="dxa"/>
+              <w:bottom w:w="70" w:type="dxa"/>
+              <w:left w:w="80" w:type="dxa"/>
+              <w:right w:w="80" w:type="dxa"/>
+            </w:tcMar>
+          </w:tcPr>
+          <w:p>
+            <w:r>
+              <w:rPr>
+                <w:rFonts w:ascii="Times New Roman" w:hAnsi="Times New Roman"/>
+                <w:b/>
+                <w:color w:val="FFFFFF"/>
+                <w:sz w:val="16"/>
+              </w:rPr>
+              <w:t>Mean CRC Set Size</w:t>
+            </w:r>
+          </w:p>
+        </w:tc>
+        <w:tc>
+          <w:tcPr>
+            <w:tcW w:type="dxa" w:w="2016"/>
+            <w:shd w:fill="0F2240"/>
+            <w:tcMar>
+              <w:top w:w="70" w:type="dxa"/>
+              <w:bottom w:w="70" w:type="dxa"/>
+              <w:left w:w="80" w:type="dxa"/>
+              <w:right w:w="80" w:type="dxa"/>
+            </w:tcMar>
+          </w:tcPr>
+          <w:p>
+            <w:r>
+              <w:rPr>
+                <w:rFonts w:ascii="Times New Roman" w:hAnsi="Times New Roman"/>
+                <w:b/>
+                <w:color w:val="FFFFFF"/>
+                <w:sz w:val="16"/>
+              </w:rPr>
+              <w:t>Empirical Coverage (Target ≥ 90%)</w:t>
+            </w:r>
+          </w:p>
+        </w:tc>
+      </w:tr>
+      <w:tr>
+        <w:tc>
+          <w:tcPr>
+            <w:tcW w:type="dxa" w:w="2016"/>
+            <w:shd w:fill="F8F9FA"/>
+            <w:tcMar>
+              <w:top w:w="50" w:type="dxa"/>
+              <w:bottom w:w="50" w:type="dxa"/>
+              <w:left w:w="70" w:type="dxa"/>
+              <w:right w:w="70" w:type="dxa"/>
+            </w:tcMar>
+          </w:tcPr>
+          <w:p>
+            <w:r>
+              <w:rPr>
+                <w:rFonts w:ascii="Times New Roman" w:hAnsi="Times New Roman"/>
+                <w:b/>
+                <w:color w:val="212529"/>
+                <w:sz w:val="16"/>
+              </w:rPr>
+              <w:t>Calibration Split (Self)</w:t>
+            </w:r>
+          </w:p>
+        </w:tc>
+        <w:tc>
+          <w:tcPr>
+            <w:tcW w:type="dxa" w:w="2016"/>
+            <w:shd w:fill="F8F9FA"/>
+            <w:tcMar>
+              <w:top w:w="50" w:type="dxa"/>
+              <w:bottom w:w="50" w:type="dxa"/>
+              <w:left w:w="70" w:type="dxa"/>
+              <w:right w:w="70" w:type="dxa"/>
+            </w:tcMar>
+          </w:tcPr>
+          <w:p>
+            <w:r>
+              <w:rPr>
+                <w:rFonts w:ascii="Times New Roman" w:hAnsi="Times New Roman"/>
+                <w:color w:val="212529"/>
+                <w:sz w:val="16"/>
+              </w:rPr>
+              <w:t>19 drives</w:t>
+            </w:r>
+          </w:p>
+        </w:tc>
+        <w:tc>
+          <w:tcPr>
+            <w:tcW w:type="dxa" w:w="2016"/>
+            <w:shd w:fill="F8F9FA"/>
+            <w:tcMar>
+              <w:top w:w="50" w:type="dxa"/>
+              <w:bottom w:w="50" w:type="dxa"/>
+              <w:left w:w="70" w:type="dxa"/>
+              <w:right w:w="70" w:type="dxa"/>
+            </w:tcMar>
+          </w:tcPr>
+          <w:p>
+            <w:r>
+              <w:rPr>
+                <w:rFonts w:ascii="Times New Roman" w:hAnsi="Times New Roman"/>
+                <w:color w:val="212529"/>
+                <w:sz w:val="16"/>
+              </w:rPr>
+              <w:t>3,705</w:t>
+            </w:r>
+          </w:p>
+        </w:tc>
+        <w:tc>
+          <w:tcPr>
+            <w:tcW w:type="dxa" w:w="2016"/>
+            <w:shd w:fill="F8F9FA"/>
+            <w:tcMar>
+              <w:top w:w="50" w:type="dxa"/>
+              <w:bottom w:w="50" w:type="dxa"/>
+              <w:left w:w="70" w:type="dxa"/>
+              <w:right w:w="70" w:type="dxa"/>
+            </w:tcMar>
+          </w:tcPr>
+          <w:p>
+            <w:r>
+              <w:rPr>
+                <w:rFonts w:ascii="Times New Roman" w:hAnsi="Times New Roman"/>
+                <w:color w:val="212529"/>
+                <w:sz w:val="16"/>
+              </w:rPr>
+              <w:t>12.1 / 256 beams</w:t>
+            </w:r>
+          </w:p>
+        </w:tc>
+        <w:tc>
+          <w:tcPr>
+            <w:tcW w:type="dxa" w:w="2016"/>
+            <w:shd w:fill="F8F9FA"/>
+            <w:tcMar>
+              <w:top w:w="50" w:type="dxa"/>
+              <w:bottom w:w="50" w:type="dxa"/>
+              <w:left w:w="70" w:type="dxa"/>
+              <w:right w:w="70" w:type="dxa"/>
+            </w:tcMar>
+          </w:tcPr>
+          <w:p>
+            <w:r>
+              <w:rPr>
+                <w:rFonts w:ascii="Times New Roman" w:hAnsi="Times New Roman"/>
+                <w:color w:val="212529"/>
+                <w:sz w:val="16"/>
+              </w:rPr>
+              <w:t>90.2% (Satisfied by construction)</w:t>
+            </w:r>
+          </w:p>
+        </w:tc>
+      </w:tr>
+      <w:tr>
+        <w:tc>
+          <w:tcPr>
+            <w:tcW w:type="dxa" w:w="2016"/>
+            <w:shd w:fill="FFFFFF"/>
+            <w:tcMar>
+              <w:top w:w="50" w:type="dxa"/>
+              <w:bottom w:w="50" w:type="dxa"/>
+              <w:left w:w="70" w:type="dxa"/>
+              <w:right w:w="70" w:type="dxa"/>
+            </w:tcMar>
+          </w:tcPr>
+          <w:p>
+            <w:r>
+              <w:rPr>
+                <w:rFonts w:ascii="Times New Roman" w:hAnsi="Times New Roman"/>
+                <w:b/>
+                <w:color w:val="212529"/>
+                <w:sz w:val="16"/>
+              </w:rPr>
+              <w:t>Validation Split</w:t>
+            </w:r>
+          </w:p>
+        </w:tc>
+        <w:tc>
+          <w:tcPr>
+            <w:tcW w:type="dxa" w:w="2016"/>
+            <w:shd w:fill="FFFFFF"/>
+            <w:tcMar>
+              <w:top w:w="50" w:type="dxa"/>
+              <w:bottom w:w="50" w:type="dxa"/>
+              <w:left w:w="70" w:type="dxa"/>
+              <w:right w:w="70" w:type="dxa"/>
+            </w:tcMar>
+          </w:tcPr>
+          <w:p>
+            <w:r>
+              <w:rPr>
+                <w:rFonts w:ascii="Times New Roman" w:hAnsi="Times New Roman"/>
+                <w:color w:val="212529"/>
+                <w:sz w:val="16"/>
+              </w:rPr>
+              <w:t>19 drives</w:t>
+            </w:r>
+          </w:p>
+        </w:tc>
+        <w:tc>
+          <w:tcPr>
+            <w:tcW w:type="dxa" w:w="2016"/>
+            <w:shd w:fill="FFFFFF"/>
+            <w:tcMar>
+              <w:top w:w="50" w:type="dxa"/>
+              <w:bottom w:w="50" w:type="dxa"/>
+              <w:left w:w="70" w:type="dxa"/>
+              <w:right w:w="70" w:type="dxa"/>
+            </w:tcMar>
+          </w:tcPr>
+          <w:p>
+            <w:r>
+              <w:rPr>
+                <w:rFonts w:ascii="Times New Roman" w:hAnsi="Times New Roman"/>
+                <w:color w:val="212529"/>
+                <w:sz w:val="16"/>
+              </w:rPr>
+              <w:t>3,705</w:t>
+            </w:r>
+          </w:p>
+        </w:tc>
+        <w:tc>
+          <w:tcPr>
+            <w:tcW w:type="dxa" w:w="2016"/>
+            <w:shd w:fill="FFFFFF"/>
+            <w:tcMar>
+              <w:top w:w="50" w:type="dxa"/>
+              <w:bottom w:w="50" w:type="dxa"/>
+              <w:left w:w="70" w:type="dxa"/>
+              <w:right w:w="70" w:type="dxa"/>
+            </w:tcMar>
+          </w:tcPr>
+          <w:p>
+            <w:r>
+              <w:rPr>
+                <w:rFonts w:ascii="Times New Roman" w:hAnsi="Times New Roman"/>
+                <w:color w:val="212529"/>
+                <w:sz w:val="16"/>
+              </w:rPr>
+              <w:t>11.8 / 256 beams</w:t>
+            </w:r>
+          </w:p>
+        </w:tc>
+        <w:tc>
+          <w:tcPr>
+            <w:tcW w:type="dxa" w:w="2016"/>
+            <w:shd w:fill="FFFFFF"/>
+            <w:tcMar>
+              <w:top w:w="50" w:type="dxa"/>
+              <w:bottom w:w="50" w:type="dxa"/>
+              <w:left w:w="70" w:type="dxa"/>
+              <w:right w:w="70" w:type="dxa"/>
+            </w:tcMar>
+          </w:tcPr>
+          <w:p>
+            <w:r>
+              <w:rPr>
+                <w:rFonts w:ascii="Times New Roman" w:hAnsi="Times New Roman"/>
+                <w:color w:val="212529"/>
+                <w:sz w:val="16"/>
+              </w:rPr>
+              <w:t>68.7% (Degraded under shift)</w:t>
+            </w:r>
+          </w:p>
+        </w:tc>
+      </w:tr>
+      <w:tr>
+        <w:tc>
+          <w:tcPr>
+            <w:tcW w:type="dxa" w:w="2016"/>
+            <w:shd w:fill="F8F9FA"/>
+            <w:tcMar>
+              <w:top w:w="50" w:type="dxa"/>
+              <w:bottom w:w="50" w:type="dxa"/>
+              <w:left w:w="70" w:type="dxa"/>
+              <w:right w:w="70" w:type="dxa"/>
+            </w:tcMar>
+          </w:tcPr>
+          <w:p>
+            <w:r>
+              <w:rPr>
+                <w:rFonts w:ascii="Times New Roman" w:hAnsi="Times New Roman"/>
+                <w:b/>
+                <w:color w:val="212529"/>
+                <w:sz w:val="16"/>
+              </w:rPr>
+              <w:t>Test Split (Unseen Drives)</w:t>
+            </w:r>
+          </w:p>
+        </w:tc>
+        <w:tc>
+          <w:tcPr>
+            <w:tcW w:type="dxa" w:w="2016"/>
+            <w:shd w:fill="F8F9FA"/>
+            <w:tcMar>
+              <w:top w:w="50" w:type="dxa"/>
+              <w:bottom w:w="50" w:type="dxa"/>
+              <w:left w:w="70" w:type="dxa"/>
+              <w:right w:w="70" w:type="dxa"/>
+            </w:tcMar>
+          </w:tcPr>
+          <w:p>
+            <w:r>
+              <w:rPr>
+                <w:rFonts w:ascii="Times New Roman" w:hAnsi="Times New Roman"/>
+                <w:color w:val="212529"/>
+                <w:sz w:val="16"/>
+              </w:rPr>
+              <w:t>18 drives</w:t>
+            </w:r>
+          </w:p>
+        </w:tc>
+        <w:tc>
+          <w:tcPr>
+            <w:tcW w:type="dxa" w:w="2016"/>
+            <w:shd w:fill="F8F9FA"/>
+            <w:tcMar>
+              <w:top w:w="50" w:type="dxa"/>
+              <w:bottom w:w="50" w:type="dxa"/>
+              <w:left w:w="70" w:type="dxa"/>
+              <w:right w:w="70" w:type="dxa"/>
+            </w:tcMar>
+          </w:tcPr>
+          <w:p>
+            <w:r>
+              <w:rPr>
+                <w:rFonts w:ascii="Times New Roman" w:hAnsi="Times New Roman"/>
+                <w:color w:val="212529"/>
+                <w:sz w:val="16"/>
+              </w:rPr>
+              <w:t>3,509</w:t>
+            </w:r>
+          </w:p>
+        </w:tc>
+        <w:tc>
+          <w:tcPr>
+            <w:tcW w:type="dxa" w:w="2016"/>
+            <w:shd w:fill="F8F9FA"/>
+            <w:tcMar>
+              <w:top w:w="50" w:type="dxa"/>
+              <w:bottom w:w="50" w:type="dxa"/>
+              <w:left w:w="70" w:type="dxa"/>
+              <w:right w:w="70" w:type="dxa"/>
+            </w:tcMar>
+          </w:tcPr>
+          <w:p>
+            <w:r>
+              <w:rPr>
+                <w:rFonts w:ascii="Times New Roman" w:hAnsi="Times New Roman"/>
+                <w:color w:val="212529"/>
+                <w:sz w:val="16"/>
+              </w:rPr>
+              <w:t>13.9 / 256 beams</w:t>
+            </w:r>
+          </w:p>
+        </w:tc>
+        <w:tc>
+          <w:tcPr>
+            <w:tcW w:type="dxa" w:w="2016"/>
+            <w:shd w:fill="F8F9FA"/>
+            <w:tcMar>
+              <w:top w:w="50" w:type="dxa"/>
+              <w:bottom w:w="50" w:type="dxa"/>
+              <w:left w:w="70" w:type="dxa"/>
+              <w:right w:w="70" w:type="dxa"/>
+            </w:tcMar>
+          </w:tcPr>
+          <w:p>
+            <w:r>
+              <w:rPr>
+                <w:rFonts w:ascii="Times New Roman" w:hAnsi="Times New Roman"/>
+                <w:b/>
+                <w:color w:val="B91C1C"/>
+                <w:sz w:val="16"/>
+              </w:rPr>
+              <w:t>33.4% (Severe coverage collapse)</w:t>
+            </w:r>
+          </w:p>
+        </w:tc>
+      </w:tr>
+    </w:tbl>
+    <w:p>
+      <w:pPr>
+        <w:spacing w:before="40" w:after="80" w:line="276" w:lineRule="auto"/>
+      </w:pPr>
+      <w:r>
+        <w:rPr>
+          <w:rFonts w:ascii="Times New Roman" w:hAnsi="Times New Roman"/>
+          <w:color w:val="212529"/>
+          <w:sz w:val="20"/>
+        </w:rPr>
+        <w:t>As Table II demonstrates, while empirical coverage on the calibration split meets the 90% target exactly (90.2%), coverage degrades to 68.7% on validation drives and collapses to 33.4% on test drives. This 2.7× shortfall is a primary empirical finding of this work: vehicular trajectory shifts (road geometry, lighting changes, variable traffic occlusion) systematically violate exchangeability, proving that one-shot offline calibration is unsafe for physical autonomous vehicles without online adaptation.</w:t>
       </w:r>
     </w:p>
     <w:p>
@@ -4757,7 +4657,7 @@
           <w:color w:val="212529"/>
           <w:sz w:val="17"/>
         </w:rPr>
-        <w:t>[1] A. Alkhateeb, S. Charan, M. Alrabeiah, T. Osman, and N. Valliappan, "DeepSense 6G: A Large-Scale Real-World Multi-Modal Sensing and Communication Dataset," IEEE Communications Magazine, vol. 61, no. 9, pp. 122–128, Sep. 2023. DOI: 10.1109/MCOM.001.2200742.</w:t>
+        <w:t>[1] A. Alkhateeb, S. Charan, M. Alrabeiah, T. Osman, and N. Valliappan, "DeepSense 6G: A large-scale real-world multi-modal sensing and communication dataset," IEEE Communications Magazine, vol. 61, no. 9, pp. 122–128, Sep. 2023.</w:t>
       </w:r>
     </w:p>
     <w:p>
@@ -4770,7 +4670,7 @@
           <w:color w:val="212529"/>
           <w:sz w:val="17"/>
         </w:rPr>
-        <w:t>[2] M. Alrabeiah and A. Alkhateeb, "Deep Learning for TDD and FDD Massive MIMO: Mapping Channels in Space and Frequency," IEEE Transactions on Wireless Communications, vol. 19, no. 5, pp. 3122–3136, May 2020. DOI: 10.1109/TWC.2020.2971515.</w:t>
+        <w:t>[2] M. Alrabeiah and A. Alkhateeb, "Deep learning for TDD and FDD massive MIMO: Mapping channels in space and frequency," in Proc. 53rd Asilomar Conference on Signals, Systems, and Computers, Pacific Grove, CA, USA, Nov. 2019, pp. 1465–1470.</w:t>
       </w:r>
     </w:p>
     <w:p>
@@ -4783,7 +4683,7 @@
           <w:color w:val="212529"/>
           <w:sz w:val="17"/>
         </w:rPr>
-        <w:t>[3] A. N. Angelopoulos and S. Bates, "A Gentle Introduction to Conformal Prediction and Distribution-Free Uncertainty Quantification," arXiv:2107.07511, 2021.</w:t>
+        <w:t>[3] A. N. Angelopoulos and S. Bates, "A gentle introduction to conformal prediction and distribution-free uncertainty quantification," arXiv preprint arXiv:2107.07511, 2021.</w:t>
       </w:r>
     </w:p>
     <w:p>
@@ -4796,7 +4696,7 @@
           <w:color w:val="212529"/>
           <w:sz w:val="17"/>
         </w:rPr>
-        <w:t>[4] A. N. Angelopoulos, S. Bates, M. Jordan, and J. Malik, "Uncertainty Sets for Image Classifiers Using Conformal Prediction," in International Conference on Learning Representations (ICLR), 2021.</w:t>
+        <w:t>[4] A. N. Angelopoulos, S. Bates, M. Jordan, and J. Malik, "Uncertainty sets for image classifiers using conformal prediction," in Proc. International Conference on Learning Representations (ICLR), 2021.</w:t>
       </w:r>
     </w:p>
     <w:p>
@@ -4809,7 +4709,7 @@
           <w:color w:val="212529"/>
           <w:sz w:val="17"/>
         </w:rPr>
-        <w:t>[5] I. Gibbs and E. Candès, "Adaptive Conformal Inference Under Distribution Shift," in Advances in Neural Information Processing Systems (NeurIPS), vol. 34, pp. 1660–1672, 2021.</w:t>
+        <w:t>[5] I. Gibbs and E. Candès, "Adaptive conformal inference under distribution shift," in Advances in Neural Information Processing Systems (NeurIPS), vol. 34, pp. 1660–1672, 2021.</w:t>
       </w:r>
     </w:p>
     <w:p>
@@ -4822,7 +4722,7 @@
           <w:color w:val="212529"/>
           <w:sz w:val="17"/>
         </w:rPr>
-        <w:t>[6] K. He, X. Zhang, S. Ren, and J. Sun, "Deep Residual Learning for Image Recognition," in IEEE Conference on Computer Vision and Pattern Recognition (CVPR), pp. 770–778, 2016. DOI: 10.1109/CVPR.2016.90.</w:t>
+        <w:t>[6] K. He, X. Zhang, S. Ren, and J. Sun, "Deep residual learning for image recognition," in Proc. IEEE Conference on Computer Vision and Pattern Recognition (CVPR), Jun. 2016, pp. 770–778.</w:t>
       </w:r>
     </w:p>
     <w:p>
@@ -4835,7 +4735,7 @@
           <w:color w:val="212529"/>
           <w:sz w:val="17"/>
         </w:rPr>
-        <w:t>[7] A. Vaswani, N. Shazeer, N. Parmar, J. Uszkoreit, L. Jones, A. N. Gomez, Ł. Kaiser, and I. Polosukhin, "Attention Is All You Need," in Advances in Neural Information Processing Systems (NeurIPS), pp. 5998–6008, 2017.</w:t>
+        <w:t>[7] A. Vaswani, N. Shazeer, N. Parmar, J. Uszkoreit, L. Jones, A. N. Gomez, Ł. Kaiser, and I. Polosukhin, "Attention is all you need," in Advances in Neural Information Processing Systems (NeurIPS), vol. 30, pp. 5998–6008, 2017.</w:t>
       </w:r>
     </w:p>
     <w:p>
@@ -4848,7 +4748,7 @@
           <w:color w:val="212529"/>
           <w:sz w:val="17"/>
         </w:rPr>
-        <w:t>[8] K. Cho, B. van Merriënboer, Ç. Gülçehre, D. Bahdanau, F. Bougares, H. Schwenk, and Y. Bengio, "Learning Phrase Representations using RNN Encoder-Decoder for Statistical Machine Translation," in Conference on Empirical Methods in Natural Language Processing (EMNLP), pp. 1724–1734, 2014.</w:t>
+        <w:t>[8] K. Cho, B. van Merriënboer, Ç. Gülçehre, D. Bahdanau, F. Bougares, H. Schwenk, and Y. Bengio, "Learning phrase representations using RNN encoder-decoder for statistical machine translation," in Proc. Conference on Empirical Methods in Natural Language Processing (EMNLP), Oct. 2014, pp. 1724–1734.</w:t>
       </w:r>
     </w:p>
     <w:p>
@@ -4861,7 +4761,7 @@
           <w:color w:val="212529"/>
           <w:sz w:val="17"/>
         </w:rPr>
-        <w:t>[9] D. S. Brilhante, M. Alrabeiah, and A. Alkhateeb, "Multimodal Transformers for Wireless Communications: A Case Study in Beam Prediction," IEEE Access, vol. 11, pp. 128509–128522, 2023. DOI: 10.1109/ACCESS.2023.3332822.</w:t>
+        <w:t>[9] D. S. Brilhante, M. Alrabeiah, and A. Alkhateeb, "Multimodal Transformers for wireless communications: A case study in beam prediction," IEEE Access, vol. 11, pp. 128509–128522, Nov. 2023.</w:t>
       </w:r>
     </w:p>
     <w:p>
@@ -4874,7 +4774,7 @@
           <w:color w:val="212529"/>
           <w:sz w:val="17"/>
         </w:rPr>
-        <w:t>[10] W. Deng, B. Shi, M. Li, and O. Simeone, "SCAN-BEST: Sub-6GHz-Aided Near-Field Beam Selection With Formal Reliability Guarantees," IEEE Transactions on Cognitive Communications and Networking, vol. 12, pp. 5506–5521, 2026. DOI: 10.1109/TCCN.2026.3657091.</w:t>
+        <w:t>[10] W. Deng, B. Shi, M. Li, and O. Simeone, "SCAN-BEST: Sub-6GHz-aided near-field beam selection with formal reliability guarantees," arXiv preprint arXiv:2503.13801, 2025.</w:t>
       </w:r>
     </w:p>
     <w:p>
@@ -4887,7 +4787,7 @@
           <w:color w:val="212529"/>
           <w:sz w:val="17"/>
         </w:rPr>
-        <w:t>[11] X. Gao, X. Xie, X. Liu, Z. Peng, X. Tao, X. Tong, C. Zhang, Z. Gong, J. Chen, S. Chen, and K. Li, "CLBP: A Cross-Modal Loss-Tolerant Beam Prediction Framework for V2V mmWave Communications," IEEE Transactions on Mobile Computing, 2026. DOI: 10.1109/TMC.2026.3674213.</w:t>
+        <w:t>[11] X. Gao, X. Xie, X. Liu, Z. Peng, X. Tao, X. Tong, C. Zhang, Z. Gong, J. Chen, S. Chen, and K. Li, "CLBP: A cross-modal loss-tolerant beam prediction framework for V2V mmWave communications," IEEE Transactions on Mobile Computing, early access, 2026.</w:t>
       </w:r>
     </w:p>
     <w:p>
@@ -4900,7 +4800,7 @@
           <w:color w:val="212529"/>
           <w:sz w:val="17"/>
         </w:rPr>
-        <w:t>[12] L. Yao, K. Ma, P. Wang, Y. Sang, and Z. Wang, "Robust Multimodal Beam Prediction With Missing Modality," IEEE Wireless Communications Letters, vol. 14, 2025. DOI: 10.1109/LWC.2025.3591611.</w:t>
+        <w:t>[12] L. Yao, K. Ma, P. Wang, Y. Sang, and Z. Wang, "Robust multimodal beam prediction with missing modality," IEEE Wireless Communications Letters, vol. 14, no. 8, pp. 2285–2289, Aug. 2025.</w:t>
       </w:r>
     </w:p>
     <w:p>
@@ -4913,7 +4813,7 @@
           <w:color w:val="212529"/>
           <w:sz w:val="17"/>
         </w:rPr>
-        <w:t>[13] A. Orimogunje, V. Ninkovic, O. Kundacina, H. Park, S. Kim, D. Vukobratovic, E. Twahirwa, and G. Gashema, "Sensing-Assisted Adaptive Beam Probing With Calibrated Multimodal Priors and Uncertainty-Aware Scheduling," IEEE Wireless Communications Letters, 2026. DOI: 10.1109/LWC.2026.3679539.</w:t>
+        <w:t>[13] A. Orimogunje, V. Ninkovic, O. Kundacina, H. Park, S. Kim, D. Vukobratovic, E. Twahirwa, and G. Gashema, "Sensing-assisted adaptive beam probing with calibrated multimodal priors and uncertainty-aware scheduling," IEEE Wireless Communications Letters, early access, 2026.</w:t>
       </w:r>
     </w:p>
     <w:p>
@@ -4926,7 +4826,7 @@
           <w:color w:val="212529"/>
           <w:sz w:val="17"/>
         </w:rPr>
-        <w:t>[14] M. Q. Khan, A. Gaber, M. Parvini, P. Schulz, and G. Fettweis, "Multi-Task Learning for mmWave Transceiver Beam Prediction," IEEE Open Journal of the Communications Society, vol. 6, pp. 1205–1218, 2025. DOI: 10.1109/OJCOMS.2025.3583074.</w:t>
+        <w:t>[14] M. Q. Khan, A. Gaber, M. Parvini, P. Schulz, and G. Fettweis, "Multi-task learning for mmWave transceiver beam prediction," IEEE Open Journal of the Communications Society, vol. 6, pp. 1205–1218, 2025.</w:t>
       </w:r>
     </w:p>
     <w:p>

</xml_diff>